<commit_message>
court(mich-sc/brief-on-the-merits): latex and docx regenerated on the model of fb-595.54.82, still reported (fb-595.54.31)
Co-Authored-By: Claude Opus 5.5 <noreply@anthropic.com>

(fb-595.54.31)
</commit_message>
<xml_diff>
--- a/courts/sixth-circuit/michigan/state/supreme-court/brief-on-the-merits/usage/OUTPUT-brief-on-the-merits.docx
+++ b/courts/sixth-circuit/michigan/state/supreme-court/brief-on-the-merits/usage/OUTPUT-brief-on-the-merits.docx
@@ -2621,7 +2621,7 @@
         <w:tab/>
       </w:r>
       <w:r>
-        <w:t xml:space="preserve">11, 12, 24, 26</w:t>
+        <w:t xml:space="preserve">11, 12, 24, 27</w:t>
       </w:r>
     </w:p>
     <w:p>
@@ -3520,7 +3520,7 @@
           <w:tab w:val="right" w:leader="dot" w:pos="9360"/>
         </w:tabs>
         <w:spacing w:before="96" w:after="0" w:line="276" w:lineRule="exact"/>
-        <w:ind w:left="720" w:right="2520" w:hanging="720"/>
+        <w:ind w:left="720" w:right="2880" w:hanging="720"/>
       </w:pPr>
       <w:r>
         <w:rPr>
@@ -3637,7 +3637,7 @@
         <w:tab/>
       </w:r>
       <w:r>
-        <w:t xml:space="preserve">8, 9, 17, 19, 20, 23, 25, 26</w:t>
+        <w:t xml:space="preserve">8, 9, 17, 19, 20, 23, 25, 26, 27</w:t>
       </w:r>
     </w:p>
     <w:p>
@@ -4675,7 +4675,7 @@
         <w:tab/>
       </w:r>
       <w:r>
-        <w:t xml:space="preserve">14, 25</w:t>
+        <w:t xml:space="preserve">14, 26</w:t>
       </w:r>
     </w:p>
     <w:p>
@@ -4774,7 +4774,7 @@
         <w:tab/>
       </w:r>
       <w:r>
-        <w:t xml:space="preserve">29</w:t>
+        <w:t xml:space="preserve">30</w:t>
       </w:r>
     </w:p>
     <w:p>
@@ -4901,7 +4901,7 @@
         <w:tab/>
       </w:r>
       <w:r>
-        <w:t xml:space="preserve">8, 27</w:t>
+        <w:t xml:space="preserve">8, 28</w:t>
       </w:r>
     </w:p>
     <w:p>
@@ -5896,7 +5896,7 @@
         <w:tab/>
       </w:r>
       <w:r>
-        <w:t xml:space="preserve">14, 25</w:t>
+        <w:t xml:space="preserve">14, 26</w:t>
       </w:r>
     </w:p>
     <w:p>
@@ -8550,7 +8550,7 @@
           <w:tab w:val="right" w:leader="dot" w:pos="9360"/>
         </w:tabs>
         <w:spacing w:before="96" w:after="0" w:line="276" w:lineRule="exact"/>
-        <w:ind w:left="720" w:right="1320" w:hanging="720"/>
+        <w:ind w:left="720" w:right="1120" w:hanging="720"/>
       </w:pPr>
       <w:r>
         <w:t xml:space="preserve">Const</w:t>
@@ -8586,7 +8586,7 @@
         <w:tab/>
       </w:r>
       <w:r>
-        <w:t xml:space="preserve">14, 17, 25, 26</w:t>
+        <w:t xml:space="preserve">14, 17, 26</w:t>
       </w:r>
     </w:p>
     <w:p>
@@ -9165,7 +9165,7 @@
         <w:pStyle w:val="BodyText"/>
       </w:pPr>
       <w:r>
-        <w:t xml:space="preserve">This section continued with: “To the extent You are not satisfied with our response You may contact the Michigan Gaming Control Board. . .” Id (emphasis added).</w:t>
+        <w:t xml:space="preserve">This section continued with: “To the extent You are not satisfied with our response You may contact the Michigan Gaming Control Board. . .” Id (emphasis added).</w:t>
       </w:r>
     </w:p>
     <w:p>
@@ -9235,7 +9235,7 @@
         <w:pStyle w:val="BodyText"/>
       </w:pPr>
       <w:r>
-        <w:t xml:space="preserve">Shortly after Ms. Davis withdrew the $100,000 from her account, she received an email from the same BetMGM representative who had congratulated her on her winnings only days before. Email (App 80a). This time, the email bore different news; BetMGM was suspending Ms. Davis’s account “given the volume of play generated.” Id. The email further indicated that BetMGM believed “there was an error in the underlying game play . . . and your account is currently under review. . .” Id.</w:t>
+        <w:t xml:space="preserve">Shortly after Ms. Davis withdrew the $100,000 from her account, she received an email from the same BetMGM representative who had congratulated her on her winnings only days before. Email (App 80a). This time, the email bore different news; BetMGM was suspending Ms. Davis’s account “given the volume of play generated.” Id. The email further indicated that BetMGM believed “there was an error in the underlying game play . . . and your account is currently under review. . .” Id.</w:t>
       </w:r>
     </w:p>
     <w:p>
@@ -9369,7 +9369,7 @@
         <w:pStyle w:val="BodyText"/>
       </w:pPr>
       <w:r>
-        <w:t xml:space="preserve">In his letter, Mr. Hicks further indicated that the Lawful Internet Gaming Act (hereinafter: “LIGA”) authorized the Gaming Board “to conduct any investigation it deems necessary as well as direct a gaming operator . . . to take corrective action as the Board consider appropriate.” But, at the same time, Mr. Hicks noted in his letter the following limitation on the authority of the Gaming Board under LIGA and its administrative rules:</w:t>
+        <w:t xml:space="preserve">In his letter, Mr. Hicks further indicated that the Lawful Internet Gaming Act (hereinafter: “LIGA”) authorized the Gaming Board “to conduct any investigation it deems necessary as well as direct a gaming operator . . . to take corrective action as the Board consider appropriate.” But, at the same time, Mr. Hicks noted in his letter the following limitation on the authority of the Gaming Board under LIGA and its administrative rules:</w:t>
       </w:r>
     </w:p>
     <w:p>
@@ -9489,7 +9489,7 @@
         <w:pStyle w:val="BodyTextNote"/>
       </w:pPr>
       <w:r>
-        <w:t xml:space="preserve">On February 10, 2022, David Murley, Deputy Director of the Gaming Board’s Online Gaming and Legal Affairs Division, wrote two letters. One of these was to Ms. Davis and her attorney. Murley Letter #1 (App 182a). That letter referenced Mark Sands’ January 24, 2022 email, reaffirming that the Gaming Board investigation into patron complaints was “not intended to determine the merits of any outstanding dispute or litigation between an authorized participant and the internet gaming operator . . .” Id. Consistent with the limited role of the Gaming Board, Mr. Murley’s February 10, 2022 letter to Ms. Davis indicated that the Gaming Board would be conducting an investigation into Ms. Davis’s complaint only to determine “whether there was a violation by BetMGM of the Act and Rules. And, if so, the appropriate remedy for such violation . . .” Id.</w:t>
+        <w:t xml:space="preserve">On February 10, 2022, David Murley, Deputy Director of the Gaming Board’s Online Gaming and Legal Affairs Division, wrote two letters. One of these was to Ms. Davis and her attorney. Murley Letter #1 (App 182a). That letter referenced Mark Sands’ January 24, 2022 email, reaffirming that the Gaming Board investigation into patron complaints was “not intended to determine the merits of any outstanding dispute or litigation between an authorized participant and the internet gaming operator . . .” Id. Consistent with the limited role of the Gaming Board, Mr. Murley’s February 10, 2022 letter to Ms. Davis indicated that the Gaming Board would be conducting an investigation into Ms. Davis’s complaint only to determine “whether there was a violation by BetMGM of the Act and Rules. And, if so, the appropriate remedy for such violation . . .” Id.</w:t>
       </w:r>
       <w:r>
         <w:rPr>
@@ -9515,7 +9515,7 @@
         <w:t xml:space="preserve"> </w:t>
       </w:r>
       <w:r>
-        <w:t xml:space="preserve">required to notify the Gaming Board immediately of “any defects or malfunctions of the internet gaming platform . . .” According to the Gaming Board’s findings, BetMGM became aware of the purported malfunction in the Luck O’ Roulette game several days before it notified the Gaming Board. Murley Letter #2, at 1 (App 183a). This late notification constituted a violation of Rule 432.632b(2). Mr. Murley’s letter to BetMGM’s CEO also noted that BetMGM had not fully cooperated with the Gaming Board’s investigation into Ms. Davis’s complaint, in violation of another administrative rule, Mich. Admin. Code R. 432.632a.</w:t>
+        <w:t xml:space="preserve">required to notify the Gaming Board immediately of “any defects or malfunctions of the internet gaming platform . . .” According to the Gaming Board’s findings, BetMGM became aware of the purported malfunction in the Luck O’ Roulette game several days before it notified the Gaming Board. Murley Letter #2, at 1 (App 183a). This late notification constituted a violation of Rule 432.632b(2). Mr. Murley’s letter to BetMGM’s CEO also noted that BetMGM had not fully cooperated with the Gaming Board’s investigation into Ms. Davis’s complaint, in violation of another administrative rule, Mich. Admin. Code R. 432.632a.</w:t>
       </w:r>
       <w:r>
         <w:t xml:space="preserve"> </w:t>
@@ -9567,7 +9567,7 @@
         <w:noBreakHyphen/>
       </w:r>
       <w:r>
-        <w:t xml:space="preserve">190a). In addressing the issues raised in BetMGM’s motion, the circuit court noted “the dearth of authority interpreting LIGA . . .” Opinion, at 3 (App 188a). In light of that fact, the circuit court deemed it appropriate to rely on a Michigan statute that was enacted 23 years before LIGA, the Michigan Gaming Control and Revenue Act, MCL 432.201,</w:t>
+        <w:t xml:space="preserve">190a). In addressing the issues raised in BetMGM’s motion, the circuit court noted “the dearth of authority interpreting LIGA . . .” Opinion, at 3 (App 188a). In light of that fact, the circuit court deemed it appropriate to rely on a Michigan statute that was enacted 23 years before LIGA, the Michigan Gaming Control and Revenue Act, MCL 432.201,</w:t>
       </w:r>
       <w:r>
         <w:t xml:space="preserve"> </w:t>
@@ -9661,7 +9661,7 @@
         <w:pStyle w:val="XdQuoteFirst"/>
       </w:pPr>
       <w:r>
-        <w:t xml:space="preserve">The question then becomes whether plaintiff’s common-law claims for fraud, conversion, and breach of contract are inconsistent with LIGA. We conclude that they are. LIGA . . . is “comprehensive legislation” that “prescribes in detail a course of conduct to pursue and the parties and things affected, and designates specific limitations and exceptions.” Kraft,</w:t>
+        <w:t xml:space="preserve">The question then becomes whether plaintiff’s common-law claims for fraud, conversion, and breach of contract are inconsistent with LIGA. We conclude that they are. LIGA . . . is “comprehensive legislation” that “prescribes in detail a course of conduct to pursue and the parties and things affected, and designates specific limitations and exceptions.” Kraft,</w:t>
       </w:r>
       <w:r>
         <w:t xml:space="preserve"> </w:t>
@@ -10626,7 +10626,7 @@
         <w:t xml:space="preserve">Michigan Gun Owners</w:t>
       </w:r>
       <w:r>
-        <w:t xml:space="preserve">, 502 Mich at 706 (“The question [of preemption] at bottom, is one of statutory intent, and we accordingly ‘begin with the language employed . . . and the assumption that the ordinary meaning of that language accurately expresses the legislative purpose.’”), quoting</w:t>
+        <w:t xml:space="preserve">, 502 Mich at 706 (“The question [of preemption] at bottom, is one of statutory intent, and we accordingly ‘begin with the language employed . . . and the assumption that the ordinary meaning of that language accurately expresses the legislative purpose.’”), quoting</w:t>
       </w:r>
       <w:r>
         <w:t xml:space="preserve"> </w:t>
@@ -10666,7 +10666,7 @@
         <w:t xml:space="preserve">DeRuiter</w:t>
       </w:r>
       <w:r>
-        <w:t xml:space="preserve">, 505 Mich at 139 (“Whether a state statute preempts a local ordinance is a question of statutory interpretation . . .”).</w:t>
+        <w:t xml:space="preserve">, 505 Mich at 139 (“Whether a state statute preempts a local ordinance is a question of statutory interpretation . . .”).</w:t>
       </w:r>
     </w:p>
     <w:p>
@@ -10828,7 +10828,7 @@
         <w:t xml:space="preserve">Ryan</w:t>
       </w:r>
       <w:r>
-        <w:t xml:space="preserve">, this implied preemption may be found where state law is in “direct conflict with federal law or with the purposes and objectives of Congress.” 454 Mich at 28. The Court has held that this type of conflict preemption arises “when compliance with both federal and state regulations is a physical impossibility . . . or when state law ‘stands as an obstacle to the accomplishment and execution of the full purposes and objectives of Congress.”</w:t>
+        <w:t xml:space="preserve">, this implied preemption may be found where state law is in “direct conflict with federal law or with the purposes and objectives of Congress.” 454 Mich at 28. The Court has held that this type of conflict preemption arises “when compliance with both federal and state regulations is a physical impossibility . . . or when state law ‘stands as an obstacle to the accomplishment and execution of the full purposes and objectives of Congress.”</w:t>
       </w:r>
       <w:r>
         <w:t xml:space="preserve"> </w:t>
@@ -10896,7 +10896,7 @@
         <w:pStyle w:val="BodyText"/>
       </w:pPr>
       <w:r>
-        <w:t xml:space="preserve">The Court has been guided by comparable considerations in addressing whether a state statute preempts a local ordinance. Such preemption will be found where the statute in question “expressly provides that the state’s authority to regulate in a specified area of the law is to be exclusive . . .”</w:t>
+        <w:t xml:space="preserve">The Court has been guided by comparable considerations in addressing whether a state statute preempts a local ordinance. Such preemption will be found where the statute in question “expressly provides that the state’s authority to regulate in a specified area of the law is to be exclusive . . .”</w:t>
       </w:r>
       <w:r>
         <w:t xml:space="preserve"> </w:t>
@@ -10968,7 +10968,7 @@
         <w:t xml:space="preserve">v City of Wyoming</w:t>
       </w:r>
       <w:r>
-        <w:t xml:space="preserve">, 495 Mich 1, 20; 846 NW2d 531 (2014). In assessing the possible preemptive effect of a state statute on a local ordinance, this Court has also recognized a type of field preemption, where “the state statutory scheme . . . occup[ies] the field of regulation that the municipality seeks to enter . . .”</w:t>
+        <w:t xml:space="preserve">, 495 Mich 1, 20; 846 NW2d 531 (2014). In assessing the possible preemptive effect of a state statute on a local ordinance, this Court has also recognized a type of field preemption, where “the state statutory scheme . . . occup[ies] the field of regulation that the municipality seeks to enter . . .”</w:t>
       </w:r>
       <w:r>
         <w:t xml:space="preserve"> </w:t>
@@ -11979,7 +11979,7 @@
         <w:t xml:space="preserve"> </w:t>
       </w:r>
       <w:r>
-        <w:t xml:space="preserve">The legislative findings that were incorporated into that act specified that the act’s purpose was “to protect residents of the state who wager on games of chance or skill through the internet . . . [and] to regulate this activity by establishing a secure, responsible, fair, and legal system of internet gaming.” MCL 432.302(d).</w:t>
+        <w:t xml:space="preserve">The legislative findings that were incorporated into that act specified that the act’s purpose was “to protect residents of the state who wager on games of chance or skill through the internet . . . [and] to regulate this activity by establishing a secure, responsible, fair, and legal system of internet gaming.” MCL 432.302(d).</w:t>
       </w:r>
     </w:p>
     <w:p>
@@ -12372,7 +12372,7 @@
         <w:t xml:space="preserve"> </w:t>
       </w:r>
       <w:r>
-        <w:t xml:space="preserve">claimed preemption based on a provision in the federal act that provided that “a state may not establish . . . or enforce a law or regulation” establishing an equipment performance or other safety standard “that is not identical to a regulation prescribed under section 4302 of this section.” 46 USC §4311</w:t>
+        <w:t xml:space="preserve">claimed preemption based on a provision in the federal act that provided that “a state may not establish . . . or enforce a law or regulation” establishing an equipment performance or other safety standard “that is not identical to a regulation prescribed under section 4302 of this section.” 46 USC §4311</w:t>
       </w:r>
       <w:r>
         <w:t xml:space="preserve"> </w:t>
@@ -12568,7 +12568,7 @@
         <w:pStyle w:val="BodyText"/>
       </w:pPr>
       <w:r>
-        <w:t xml:space="preserve">The Court of Appeals majority at least began its preemption analysis correctly, recognizing that the central question to be decided was one of legislative intent and that this determination had to “begin with the language of the statute itself . . . presum[ing] that the Legislature’s intended meaning was as plainly expressed by the unambiguous language of the statute.” Opinion, at 3 (App 207a).</w:t>
+        <w:t xml:space="preserve">The Court of Appeals majority at least began its preemption analysis correctly, recognizing that the central question to be decided was one of legislative intent and that this determination had to “begin with the language of the statute itself . . . presum[ing] that the Legislature’s intended meaning was as plainly expressed by the unambiguous language of the statute.” Opinion, at 3 (App 207a).</w:t>
       </w:r>
     </w:p>
     <w:p>
@@ -12728,7 +12728,7 @@
         <w:pStyle w:val="XdQuoteFirst"/>
       </w:pPr>
       <w:r>
-        <w:t xml:space="preserve">Requiring courts . . . to consider field preemption even when an unambiguous statute establishes legislative intent to regulate the subject matter only partially would be an internally contradictory exercise and contrary to this Court’s general rules of statutory interpretation. The Legislature’s partial list of local units of government that may not regulate firearms answers, definitively, the field-preemption question.</w:t>
+        <w:t xml:space="preserve">Requiring courts . . . to consider field preemption even when an unambiguous statute establishes legislative intent to regulate the subject matter only partially would be an internally contradictory exercise and contrary to this Court’s general rules of statutory interpretation. The Legislature’s partial list of local units of government that may not regulate firearms answers, definitively, the field-preemption question.</w:t>
       </w:r>
     </w:p>
     <w:p>
@@ -12910,7 +12910,7 @@
         <w:pStyle w:val="XdQuoteFirst"/>
       </w:pPr>
       <w:r>
-        <w:t xml:space="preserve">[W]hen Congress has considered the issue of pre-emption and has included in the enacted legislation a provision explicitly addressing that issue, and when that provision provides a ‘reliable indicium of congressional intent with respect to state authority’ . . . ‘there is no need to infer congressional intent to pre-empt state laws from the substantive provisions’ of the legislation.</w:t>
+        <w:t xml:space="preserve">[W]hen Congress has considered the issue of pre-emption and has included in the enacted legislation a provision explicitly addressing that issue, and when that provision provides a ‘reliable indicium of congressional intent with respect to state authority’ . . . ‘there is no need to infer congressional intent to pre-empt state laws from the substantive provisions’ of the legislation.</w:t>
       </w:r>
     </w:p>
     <w:p>
@@ -13183,7 +13183,7 @@
         <w:pStyle w:val="BodyText"/>
       </w:pPr>
       <w:r>
-        <w:t xml:space="preserve">There is nothing in the tort and breach of contract claims that Ms. Davis has alleged in this case that creates a direct conflict with LIGA and its purpose. Ms. Davis has alleged in this case that an internet gaming operator has tortiously converted her property, engaged in fraud, and breached a contract that existed between them. These claims of impropriety on the part of an internet gaming operator could hardly be considered in direct conflict with a statute whose express purpose is to “protect residents of this state who wager on games of chance or skill through the internet . . . by establishing a secure, responsible, fair, and legal system of internet gaming.” MCL 432.302(d).</w:t>
+        <w:t xml:space="preserve">There is nothing in the tort and breach of contract claims that Ms. Davis has alleged in this case that creates a direct conflict with LIGA and its purpose. Ms. Davis has alleged in this case that an internet gaming operator has tortiously converted her property, engaged in fraud, and breached a contract that existed between them. These claims of impropriety on the part of an internet gaming operator could hardly be considered in direct conflict with a statute whose express purpose is to “protect residents of this state who wager on games of chance or skill through the internet . . . by establishing a secure, responsible, fair, and legal system of internet gaming.” MCL 432.302(d).</w:t>
       </w:r>
       <w:r>
         <w:t xml:space="preserve"> </w:t>
@@ -13324,7 +13324,7 @@
         <w:t xml:space="preserve"> </w:t>
       </w:r>
       <w:r>
-        <w:t xml:space="preserve">turned on the question of whether “recognizing plaintiff’s actions for fraud and unjust enrichment . . . would be inconsistent with the act.” 261 Mich App at 547.</w:t>
+        <w:t xml:space="preserve">turned on the question of whether “recognizing plaintiff’s actions for fraud and unjust enrichment . . . would be inconsistent with the act.” 261 Mich App at 547.</w:t>
       </w:r>
     </w:p>
     <w:p>
@@ -13997,7 +13997,7 @@
         <w:pStyle w:val="BodyText"/>
       </w:pPr>
       <w:r>
-        <w:t xml:space="preserve">But while the Gaming Board views itself as having broad authority to address violations of LIGA by one of its licensees, it does not have authority to “determine the merits of any outstanding dispute or litigation between an authorized participant and the internet gaming operation . . .” Id.</w:t>
+        <w:t xml:space="preserve">But while the Gaming Board views itself as having broad authority to address violations of LIGA by one of its licensees, it does not have authority to “determine the merits of any outstanding dispute or litigation between an authorized participant and the internet gaming operation . . .” Id.</w:t>
       </w:r>
     </w:p>
     <w:p>
@@ -14013,7 +14013,7 @@
         <w:pStyle w:val="BodyText"/>
       </w:pPr>
       <w:r>
-        <w:t xml:space="preserve">The position that BetMGM has taken in this case with respect to the Gaming Board’s exclusive jurisdiction not only suffers from a complete lack of Legislative intent to vest the Gaming Board with such jurisdiction, it also runs afoul of the usual deference that Michigan courts are to give an administrative agency in the interpretation of the statutes that an agency is responsible for enforcing. While this Court is not bound by an agency’s determination, it does give “respectful consideration to the construction of a statute by an agency charged with implementation and enforcement of the statute such that an agency’s interpretation will not be overruled absent cogent reasons for doing so . . .”</w:t>
+        <w:t xml:space="preserve">The position that BetMGM has taken in this case with respect to the Gaming Board’s exclusive jurisdiction not only suffers from a complete lack of Legislative intent to vest the Gaming Board with such jurisdiction, it also runs afoul of the usual deference that Michigan courts are to give an administrative agency in the interpretation of the statutes that an agency is responsible for enforcing. While this Court is not bound by an agency’s determination, it does give “respectful consideration to the construction of a statute by an agency charged with implementation and enforcement of the statute such that an agency’s interpretation will not be overruled absent cogent reasons for doing so . . .”</w:t>
       </w:r>
       <w:r>
         <w:t xml:space="preserve"> </w:t>
@@ -15054,7 +15054,7 @@
         <w:t xml:space="preserve"> </w:t>
       </w:r>
       <w:r>
-        <w:t xml:space="preserve">David Hicks’s July 28, 2021 letter (App 116a), Mark Sands’s January 24, 2024 email (App 181a), and David Murley’s February 10, 2022 letter to Ms. Davis (App 182a), could not have made the position of the Gaming Board any clearer – the Gaming Board did not view itself as having the authority to adjudicate Ms. Davis’s common-law claims against BetMGM. The clarity of these three missives has not prevented BetMGM from misrepresenting the Gaming Board’s view of its authority throughout the course of this litigation. For example, in BetMGM’s response to the application for leave that Ms. Davis filed in this Court, the defendant represented that, “[d]espite having the power to do so if it determined there was a violation, the [Gaming Board] did not require BetMGM to unsuspend Davis’s account, which would have released the remaining account balance to Davis.” Defendant’s Answer to Application, at 6. This misstatement should be compared to the unequivocal contents of Mr. Hicks’s letter, Mr. Sands’s email, and Mr. Murley’s letter, which made it clear three times over that “the Board does not . . . determine the validity of a dispute between the authorized participant and the licensee.” Sands’ Email (App 181a).</w:t>
+        <w:t xml:space="preserve">David Hicks’s July 28, 2021 letter (App 116a), Mark Sands’s January 24, 2024 email (App 181a), and David Murley’s February 10, 2022 letter to Ms. Davis (App 182a), could not have made the position of the Gaming Board any clearer – the Gaming Board did not view itself as having the authority to adjudicate Ms. Davis’s common-law claims against BetMGM. The clarity of these three missives has not prevented BetMGM from misrepresenting the Gaming Board’s view of its authority throughout the course of this litigation. For example, in BetMGM’s response to the application for leave that Ms. Davis filed in this Court, the defendant represented that, “[d]espite having the power to do so if it determined there was a violation, the [Gaming Board] did not require BetMGM to unsuspend Davis’s account, which would have released the remaining account balance to Davis.” Defendant’s Answer to Application, at 6. This misstatement should be compared to the unequivocal contents of Mr. Hicks’s letter, Mr. Sands’s email, and Mr. Murley’s letter, which made it clear three times over that “the Board does not . . . determine the validity of a dispute between the authorized participant and the licensee.” Sands’ Email (App 181a).</w:t>
       </w:r>
     </w:p>
   </w:footnote>
@@ -15289,7 +15289,7 @@
         <w:t xml:space="preserve">Hegedus</w:t>
       </w:r>
       <w:r>
-        <w:t xml:space="preserve">, 432 Mich at 607. Among the types of implied preemption that this Court has identified is field preemption which exists where “the Legislature has impliedly occupied the field . . .”</w:t>
+        <w:t xml:space="preserve">, 432 Mich at 607. Among the types of implied preemption that this Court has identified is field preemption which exists where “the Legislature has impliedly occupied the field . . .”</w:t>
       </w:r>
       <w:r>
         <w:t xml:space="preserve"> </w:t>
@@ -15373,7 +15373,7 @@
         <w:t xml:space="preserve"> </w:t>
       </w:r>
       <w:r>
-        <w:t xml:space="preserve">That statute, which was first enacted in 1931, provides that a person who has lost “any sum of money . . . by playing or betting on cards, dice, or any other device in the nature of such playing or betting . . .” has the right to sue to recover the amount lost.</w:t>
+        <w:t xml:space="preserve">That statute, which was first enacted in 1931, provides that a person who has lost “any sum of money . . . by playing or betting on cards, dice, or any other device in the nature of such playing or betting . . .” has the right to sue to recover the amount lost.</w:t>
       </w:r>
     </w:p>
   </w:footnote>
@@ -15392,7 +15392,7 @@
         <w:t xml:space="preserve"> </w:t>
       </w:r>
       <w:r>
-        <w:t xml:space="preserve">That statute, which has existed in some form for over 150 years, allows a plaintiff to sue to recover “money or goods [that] came to the hands of the defendant by gaming . . .” MCL 600.2939(1).</w:t>
+        <w:t xml:space="preserve">That statute, which has existed in some form for over 150 years, allows a plaintiff to sue to recover “money or goods [that] came to the hands of the defendant by gaming . . .” MCL 600.2939(1).</w:t>
       </w:r>
     </w:p>
   </w:footnote>
@@ -15487,7 +15487,7 @@
         <w:t xml:space="preserve">v Keeler Brass Co</w:t>
       </w:r>
       <w:r>
-        <w:t xml:space="preserve">, 461 Mich 602, 609; 608 NW2d 45 (2000) (“to the extent that the common law is inconsistent with the statute, the common law has been changed. . .”);</w:t>
+        <w:t xml:space="preserve">, 461 Mich 602, 609; 608 NW2d 45 (2000) (“to the extent that the common law is inconsistent with the statute, the common law has been changed. . .”);</w:t>
       </w:r>
       <w:r>
         <w:t xml:space="preserve"> </w:t>
@@ -15606,7 +15606,7 @@
         <w:t xml:space="preserve"> </w:t>
       </w:r>
       <w:r>
-        <w:t xml:space="preserve">LIGA, it should be noted, was passed by the Legislature, not with “the approval of a majority of electors voting in a statewide general election . . .” See Const. 1963, art. 4, §41.</w:t>
+        <w:t xml:space="preserve">LIGA, it should be noted, was passed by the Legislature, not with “the approval of a majority of electors voting in a statewide general election . . .” See Const. 1963, art. 4, §41.</w:t>
       </w:r>
     </w:p>
   </w:footnote>
@@ -15916,7 +15916,7 @@
         <w:t xml:space="preserve"> </w:t>
       </w:r>
       <w:r>
-        <w:t xml:space="preserve">The Terms of Service do not indicate that such review is mandatory. Moreover, the following section of the Terms of Service specifically provides that this agreement is to be construed under the laws of Michigan and, by entering into this agreement, Ms. Davis “irrevocably agree[d] to the exclusive consideration of the courts of Michigan for settlement of any dispute . . .” Terms of Service, ¶29 (App 27a). Both of these provisions refute BetMGM’s argument that the Gaming Board has plenary authority to resolve disputes such as Ms. Davis’s.</w:t>
+        <w:t xml:space="preserve">The Terms of Service do not indicate that such review is mandatory. Moreover, the following section of the Terms of Service specifically provides that this agreement is to be construed under the laws of Michigan and, by entering into this agreement, Ms. Davis “irrevocably agree[d] to the exclusive consideration of the courts of Michigan for settlement of any dispute . . .” Terms of Service, ¶29 (App 27a). Both of these provisions refute BetMGM’s argument that the Gaming Board has plenary authority to resolve disputes such as Ms. Davis’s.</w:t>
       </w:r>
     </w:p>
   </w:footnote>
@@ -16658,6 +16658,7 @@
     <w:unhideWhenUsed/>
     <w:qFormat/>
     <w:pPr>
+      <w:keepLines/>
       <w:spacing w:before="0" w:after="120" w:line="276" w:lineRule="exact"/>
     </w:pPr>
     <w:rPr>
@@ -16908,6 +16909,33 @@
     <w:pPr>
       <w:spacing w:before="0" w:after="0" w:line="276" w:lineRule="exact"/>
       <w:ind w:left="2160" w:hanging="720"/>
+    </w:pPr>
+  </w:style>
+  <w:style w:type="paragraph" w:customStyle="1" w:styleId="XdQuoteList1">
+    <w:name w:val="Xd Quote List 1"/>
+    <w:basedOn w:val="Normal"/>
+    <w:qFormat/>
+    <w:pPr>
+      <w:spacing w:before="0" w:after="0" w:line="276" w:lineRule="exact"/>
+      <w:ind w:left="1440" w:right="720" w:hanging="720"/>
+    </w:pPr>
+  </w:style>
+  <w:style w:type="paragraph" w:customStyle="1" w:styleId="XdQuoteList2">
+    <w:name w:val="Xd Quote List 2"/>
+    <w:basedOn w:val="Normal"/>
+    <w:qFormat/>
+    <w:pPr>
+      <w:spacing w:before="0" w:after="0" w:line="276" w:lineRule="exact"/>
+      <w:ind w:left="2160" w:right="720" w:hanging="720"/>
+    </w:pPr>
+  </w:style>
+  <w:style w:type="paragraph" w:customStyle="1" w:styleId="XdQuoteList3">
+    <w:name w:val="Xd Quote List 3"/>
+    <w:basedOn w:val="Normal"/>
+    <w:qFormat/>
+    <w:pPr>
+      <w:spacing w:before="0" w:after="0" w:line="276" w:lineRule="exact"/>
+      <w:ind w:left="2880" w:right="720" w:hanging="720"/>
     </w:pPr>
   </w:style>
   <w:style w:type="paragraph" w:customStyle="1" w:styleId="XdQuote">

</xml_diff>